<commit_message>
Seguro-Receita conforme o art. 117: numerador com o IBS total pelo destino, média móvel mensal e população completa de 2019 a 2026
Co-Authored-By: Claude Sonnet 5.5 <noreply@anthropic.com>
Claude-Session: https://claude.ai/code/session_011eEoECqArDQbSEYFrfCHxJ
</commit_message>
<xml_diff>
--- a/data/auditoria-pr-validacao/tabelas-artigo/tabela-receita-estadual-uf-2029-2033.docx
+++ b/data/auditoria-pr-validacao/tabelas-artigo/tabela-receita-estadual-uf-2029-2033.docx
@@ -536,7 +536,7 @@
                 <w:b w:val="0"/>
                 <w:sz w:val="18"/>
               </w:rPr>
-              <w:t>5,2</w:t>
+              <w:t>5,1</w:t>
             </w:r>
           </w:p>
         </w:tc>
@@ -555,7 +555,7 @@
                 <w:b w:val="0"/>
                 <w:sz w:val="18"/>
               </w:rPr>
-              <w:t>−1,2%</w:t>
+              <w:t>−1,3%</w:t>
             </w:r>
           </w:p>
         </w:tc>
@@ -574,7 +574,7 @@
                 <w:b w:val="0"/>
                 <w:sz w:val="18"/>
               </w:rPr>
-              <w:t>−2,2%</w:t>
+              <w:t>−2,5%</w:t>
             </w:r>
           </w:p>
         </w:tc>
@@ -593,7 +593,7 @@
                 <w:b w:val="0"/>
                 <w:sz w:val="18"/>
               </w:rPr>
-              <w:t>−3,2%</w:t>
+              <w:t>−3,6%</w:t>
             </w:r>
           </w:p>
         </w:tc>
@@ -612,7 +612,7 @@
                 <w:b w:val="0"/>
                 <w:sz w:val="18"/>
               </w:rPr>
-              <w:t>−4,3%</w:t>
+              <w:t>−4,7%</w:t>
             </w:r>
           </w:p>
         </w:tc>
@@ -631,7 +631,7 @@
                 <w:b w:val="0"/>
                 <w:sz w:val="18"/>
               </w:rPr>
-              <w:t>−8,8%</w:t>
+              <w:t>−9,4%</w:t>
             </w:r>
           </w:p>
         </w:tc>
@@ -709,7 +709,7 @@
                 <w:b w:val="0"/>
                 <w:sz w:val="18"/>
               </w:rPr>
-              <w:t>21,0</w:t>
+              <w:t>20,9</w:t>
             </w:r>
           </w:p>
         </w:tc>
@@ -728,6 +728,25 @@
                 <w:b w:val="0"/>
                 <w:sz w:val="18"/>
               </w:rPr>
+              <w:t>21,1</w:t>
+            </w:r>
+          </w:p>
+        </w:tc>
+        <w:tc>
+          <w:tcPr>
+            <w:tcW w:type="dxa" w:w="737"/>
+          </w:tcPr>
+          <w:p>
+            <w:pPr>
+              <w:spacing w:after="0" w:before="20"/>
+              <w:jc w:val="right"/>
+            </w:pPr>
+            <w:r/>
+            <w:r>
+              <w:rPr>
+                <w:b w:val="0"/>
+                <w:sz w:val="18"/>
+              </w:rPr>
               <w:t>21,3</w:t>
             </w:r>
           </w:p>
@@ -747,13 +766,13 @@
                 <w:b w:val="0"/>
                 <w:sz w:val="18"/>
               </w:rPr>
-              <w:t>21,5</w:t>
-            </w:r>
-          </w:p>
-        </w:tc>
-        <w:tc>
-          <w:tcPr>
-            <w:tcW w:type="dxa" w:w="737"/>
+              <w:t>20,8</w:t>
+            </w:r>
+          </w:p>
+        </w:tc>
+        <w:tc>
+          <w:tcPr>
+            <w:tcW w:type="dxa" w:w="879"/>
           </w:tcPr>
           <w:p>
             <w:pPr>
@@ -766,7 +785,7 @@
                 <w:b w:val="0"/>
                 <w:sz w:val="18"/>
               </w:rPr>
-              <w:t>21,1</w:t>
+              <w:t>−1,3%</w:t>
             </w:r>
           </w:p>
         </w:tc>
@@ -785,7 +804,7 @@
                 <w:b w:val="0"/>
                 <w:sz w:val="18"/>
               </w:rPr>
-              <w:t>−1,1%</w:t>
+              <w:t>−2,5%</w:t>
             </w:r>
           </w:p>
         </w:tc>
@@ -804,7 +823,7 @@
                 <w:b w:val="0"/>
                 <w:sz w:val="18"/>
               </w:rPr>
-              <w:t>−2,0%</w:t>
+              <w:t>−3,6%</w:t>
             </w:r>
           </w:p>
         </w:tc>
@@ -823,7 +842,7 @@
                 <w:b w:val="0"/>
                 <w:sz w:val="18"/>
               </w:rPr>
-              <w:t>−3,0%</w:t>
+              <w:t>−4,8%</w:t>
             </w:r>
           </w:p>
         </w:tc>
@@ -842,26 +861,7 @@
                 <w:b w:val="0"/>
                 <w:sz w:val="18"/>
               </w:rPr>
-              <w:t>−3,9%</w:t>
-            </w:r>
-          </w:p>
-        </w:tc>
-        <w:tc>
-          <w:tcPr>
-            <w:tcW w:type="dxa" w:w="879"/>
-          </w:tcPr>
-          <w:p>
-            <w:pPr>
-              <w:spacing w:after="0" w:before="20"/>
-              <w:jc w:val="right"/>
-            </w:pPr>
-            <w:r/>
-            <w:r>
-              <w:rPr>
-                <w:b w:val="0"/>
-                <w:sz w:val="18"/>
-              </w:rPr>
-              <w:t>−7,9%</w:t>
+              <w:t>−9,0%</w:t>
             </w:r>
           </w:p>
         </w:tc>
@@ -882,7 +882,7 @@
                 <w:b w:val="0"/>
                 <w:sz w:val="18"/>
               </w:rPr>
-              <w:t>AL</w:t>
+              <w:t>ES</w:t>
             </w:r>
           </w:p>
         </w:tc>
@@ -901,7 +901,7 @@
                 <w:b w:val="0"/>
                 <w:sz w:val="18"/>
               </w:rPr>
-              <w:t>6,9</w:t>
+              <w:t>17,0</w:t>
             </w:r>
           </w:p>
         </w:tc>
@@ -920,7 +920,7 @@
                 <w:b w:val="0"/>
                 <w:sz w:val="18"/>
               </w:rPr>
-              <w:t>7,4</w:t>
+              <w:t>18,1</w:t>
             </w:r>
           </w:p>
         </w:tc>
@@ -939,7 +939,7 @@
                 <w:b w:val="0"/>
                 <w:sz w:val="18"/>
               </w:rPr>
-              <w:t>7,5</w:t>
+              <w:t>18,3</w:t>
             </w:r>
           </w:p>
         </w:tc>
@@ -958,7 +958,7 @@
                 <w:b w:val="0"/>
                 <w:sz w:val="18"/>
               </w:rPr>
-              <w:t>7,6</w:t>
+              <w:t>18,5</w:t>
             </w:r>
           </w:p>
         </w:tc>
@@ -977,7 +977,7 @@
                 <w:b w:val="0"/>
                 <w:sz w:val="18"/>
               </w:rPr>
-              <w:t>7,7</w:t>
+              <w:t>18,7</w:t>
             </w:r>
           </w:p>
         </w:tc>
@@ -996,7 +996,7 @@
                 <w:b w:val="0"/>
                 <w:sz w:val="18"/>
               </w:rPr>
-              <w:t>7,5</w:t>
+              <w:t>18,4</w:t>
             </w:r>
           </w:p>
         </w:tc>
@@ -1015,7 +1015,7 @@
                 <w:b w:val="0"/>
                 <w:sz w:val="18"/>
               </w:rPr>
-              <w:t>−1,0%</w:t>
+              <w:t>−1,2%</w:t>
             </w:r>
           </w:p>
         </w:tc>
@@ -1034,7 +1034,7 @@
                 <w:b w:val="0"/>
                 <w:sz w:val="18"/>
               </w:rPr>
-              <w:t>−1,9%</w:t>
+              <w:t>−2,2%</w:t>
             </w:r>
           </w:p>
         </w:tc>
@@ -1053,7 +1053,7 @@
                 <w:b w:val="0"/>
                 <w:sz w:val="18"/>
               </w:rPr>
-              <w:t>−2,8%</w:t>
+              <w:t>−3,2%</w:t>
             </w:r>
           </w:p>
         </w:tc>
@@ -1072,7 +1072,7 @@
                 <w:b w:val="0"/>
                 <w:sz w:val="18"/>
               </w:rPr>
-              <w:t>−3,6%</w:t>
+              <w:t>−4,2%</w:t>
             </w:r>
           </w:p>
         </w:tc>
@@ -1091,7 +1091,7 @@
                 <w:b w:val="0"/>
                 <w:sz w:val="18"/>
               </w:rPr>
-              <w:t>−7,3%</w:t>
+              <w:t>−7,6%</w:t>
             </w:r>
           </w:p>
         </w:tc>
@@ -1112,7 +1112,7 @@
                 <w:b w:val="0"/>
                 <w:sz w:val="18"/>
               </w:rPr>
-              <w:t>ES</w:t>
+              <w:t>AL</w:t>
             </w:r>
           </w:p>
         </w:tc>
@@ -1131,7 +1131,7 @@
                 <w:b w:val="0"/>
                 <w:sz w:val="18"/>
               </w:rPr>
-              <w:t>17,0</w:t>
+              <w:t>6,9</w:t>
             </w:r>
           </w:p>
         </w:tc>
@@ -1150,7 +1150,7 @@
                 <w:b w:val="0"/>
                 <w:sz w:val="18"/>
               </w:rPr>
-              <w:t>18,2</w:t>
+              <w:t>7,4</w:t>
             </w:r>
           </w:p>
         </w:tc>
@@ -1169,7 +1169,7 @@
                 <w:b w:val="0"/>
                 <w:sz w:val="18"/>
               </w:rPr>
-              <w:t>18,4</w:t>
+              <w:t>7,5</w:t>
             </w:r>
           </w:p>
         </w:tc>
@@ -1188,7 +1188,7 @@
                 <w:b w:val="0"/>
                 <w:sz w:val="18"/>
               </w:rPr>
-              <w:t>18,6</w:t>
+              <w:t>7,6</w:t>
             </w:r>
           </w:p>
         </w:tc>
@@ -1207,7 +1207,7 @@
                 <w:b w:val="0"/>
                 <w:sz w:val="18"/>
               </w:rPr>
-              <w:t>18,9</w:t>
+              <w:t>7,7</w:t>
             </w:r>
           </w:p>
         </w:tc>
@@ -1226,7 +1226,7 @@
                 <w:b w:val="0"/>
                 <w:sz w:val="18"/>
               </w:rPr>
-              <w:t>18,6</w:t>
+              <w:t>7,5</w:t>
             </w:r>
           </w:p>
         </w:tc>
@@ -1264,7 +1264,7 @@
                 <w:b w:val="0"/>
                 <w:sz w:val="18"/>
               </w:rPr>
-              <w:t>−1,8%</w:t>
+              <w:t>−1,9%</w:t>
             </w:r>
           </w:p>
         </w:tc>
@@ -1283,7 +1283,7 @@
                 <w:b w:val="0"/>
                 <w:sz w:val="18"/>
               </w:rPr>
-              <w:t>−2,6%</w:t>
+              <w:t>−2,8%</w:t>
             </w:r>
           </w:p>
         </w:tc>
@@ -1302,7 +1302,7 @@
                 <w:b w:val="0"/>
                 <w:sz w:val="18"/>
               </w:rPr>
-              <w:t>−3,4%</w:t>
+              <w:t>−3,6%</w:t>
             </w:r>
           </w:p>
         </w:tc>
@@ -1321,7 +1321,7 @@
                 <w:b w:val="0"/>
                 <w:sz w:val="18"/>
               </w:rPr>
-              <w:t>−6,6%</w:t>
+              <w:t>−7,3%</w:t>
             </w:r>
           </w:p>
         </w:tc>
@@ -1342,7 +1342,7 @@
                 <w:b w:val="0"/>
                 <w:sz w:val="18"/>
               </w:rPr>
-              <w:t>MA</w:t>
+              <w:t>RO</w:t>
             </w:r>
           </w:p>
         </w:tc>
@@ -1361,7 +1361,7 @@
                 <w:b w:val="0"/>
                 <w:sz w:val="18"/>
               </w:rPr>
-              <w:t>11,9</w:t>
+              <w:t>6,1</w:t>
             </w:r>
           </w:p>
         </w:tc>
@@ -1380,7 +1380,7 @@
                 <w:b w:val="0"/>
                 <w:sz w:val="18"/>
               </w:rPr>
-              <w:t>12,8</w:t>
+              <w:t>6,5</w:t>
             </w:r>
           </w:p>
         </w:tc>
@@ -1399,7 +1399,7 @@
                 <w:b w:val="0"/>
                 <w:sz w:val="18"/>
               </w:rPr>
-              <w:t>13,0</w:t>
+              <w:t>6,6</w:t>
             </w:r>
           </w:p>
         </w:tc>
@@ -1418,7 +1418,7 @@
                 <w:b w:val="0"/>
                 <w:sz w:val="18"/>
               </w:rPr>
-              <w:t>13,2</w:t>
+              <w:t>6,6</w:t>
             </w:r>
           </w:p>
         </w:tc>
@@ -1437,7 +1437,7 @@
                 <w:b w:val="0"/>
                 <w:sz w:val="18"/>
               </w:rPr>
-              <w:t>13,4</w:t>
+              <w:t>6,7</w:t>
             </w:r>
           </w:p>
         </w:tc>
@@ -1456,7 +1456,7 @@
                 <w:b w:val="0"/>
                 <w:sz w:val="18"/>
               </w:rPr>
-              <w:t>13,1</w:t>
+              <w:t>6,7</w:t>
             </w:r>
           </w:p>
         </w:tc>
@@ -1475,7 +1475,7 @@
                 <w:b w:val="0"/>
                 <w:sz w:val="18"/>
               </w:rPr>
-              <w:t>−0,8%</w:t>
+              <w:t>−1,2%</w:t>
             </w:r>
           </w:p>
         </w:tc>
@@ -1494,7 +1494,7 @@
                 <w:b w:val="0"/>
                 <w:sz w:val="18"/>
               </w:rPr>
-              <w:t>−1,3%</w:t>
+              <w:t>−2,2%</w:t>
             </w:r>
           </w:p>
         </w:tc>
@@ -1513,7 +1513,7 @@
                 <w:b w:val="0"/>
                 <w:sz w:val="18"/>
               </w:rPr>
-              <w:t>−1,9%</w:t>
+              <w:t>−3,2%</w:t>
             </w:r>
           </w:p>
         </w:tc>
@@ -1532,7 +1532,7 @@
                 <w:b w:val="0"/>
                 <w:sz w:val="18"/>
               </w:rPr>
-              <w:t>−2,5%</w:t>
+              <w:t>−4,3%</w:t>
             </w:r>
           </w:p>
         </w:tc>
@@ -1551,7 +1551,7 @@
                 <w:b w:val="0"/>
                 <w:sz w:val="18"/>
               </w:rPr>
-              <w:t>−6,4%</w:t>
+              <w:t>−7,2%</w:t>
             </w:r>
           </w:p>
         </w:tc>
@@ -1572,7 +1572,7 @@
                 <w:b w:val="0"/>
                 <w:sz w:val="18"/>
               </w:rPr>
-              <w:t>RO</w:t>
+              <w:t>MA</w:t>
             </w:r>
           </w:p>
         </w:tc>
@@ -1591,7 +1591,7 @@
                 <w:b w:val="0"/>
                 <w:sz w:val="18"/>
               </w:rPr>
-              <w:t>6,1</w:t>
+              <w:t>11,9</w:t>
             </w:r>
           </w:p>
         </w:tc>
@@ -1610,7 +1610,7 @@
                 <w:b w:val="0"/>
                 <w:sz w:val="18"/>
               </w:rPr>
-              <w:t>6,5</w:t>
+              <w:t>12,8</w:t>
             </w:r>
           </w:p>
         </w:tc>
@@ -1629,7 +1629,7 @@
                 <w:b w:val="0"/>
                 <w:sz w:val="18"/>
               </w:rPr>
-              <w:t>6,6</w:t>
+              <w:t>13,0</w:t>
             </w:r>
           </w:p>
         </w:tc>
@@ -1648,7 +1648,7 @@
                 <w:b w:val="0"/>
                 <w:sz w:val="18"/>
               </w:rPr>
-              <w:t>6,7</w:t>
+              <w:t>13,2</w:t>
             </w:r>
           </w:p>
         </w:tc>
@@ -1667,7 +1667,7 @@
                 <w:b w:val="0"/>
                 <w:sz w:val="18"/>
               </w:rPr>
-              <w:t>6,8</w:t>
+              <w:t>13,4</w:t>
             </w:r>
           </w:p>
         </w:tc>
@@ -1686,7 +1686,7 @@
                 <w:b w:val="0"/>
                 <w:sz w:val="18"/>
               </w:rPr>
-              <w:t>6,8</w:t>
+              <w:t>13,1</w:t>
             </w:r>
           </w:p>
         </w:tc>
@@ -1705,7 +1705,7 @@
                 <w:b w:val="0"/>
                 <w:sz w:val="18"/>
               </w:rPr>
-              <w:t>−0,9%</w:t>
+              <w:t>−0,8%</w:t>
             </w:r>
           </w:p>
         </w:tc>
@@ -1724,7 +1724,7 @@
                 <w:b w:val="0"/>
                 <w:sz w:val="18"/>
               </w:rPr>
-              <w:t>−1,6%</w:t>
+              <w:t>−1,3%</w:t>
             </w:r>
           </w:p>
         </w:tc>
@@ -1743,7 +1743,7 @@
                 <w:b w:val="0"/>
                 <w:sz w:val="18"/>
               </w:rPr>
-              <w:t>−2,3%</w:t>
+              <w:t>−1,9%</w:t>
             </w:r>
           </w:p>
         </w:tc>
@@ -1762,7 +1762,7 @@
                 <w:b w:val="0"/>
                 <w:sz w:val="18"/>
               </w:rPr>
-              <w:t>−3,0%</w:t>
+              <w:t>−2,5%</w:t>
             </w:r>
           </w:p>
         </w:tc>
@@ -1781,7 +1781,7 @@
                 <w:b w:val="0"/>
                 <w:sz w:val="18"/>
               </w:rPr>
-              <w:t>−5,6%</w:t>
+              <w:t>−6,4%</w:t>
             </w:r>
           </w:p>
         </w:tc>
@@ -2262,7 +2262,7 @@
                 <w:b w:val="0"/>
                 <w:sz w:val="18"/>
               </w:rPr>
-              <w:t>RR</w:t>
+              <w:t>MS</w:t>
             </w:r>
           </w:p>
         </w:tc>
@@ -2281,7 +2281,7 @@
                 <w:b w:val="0"/>
                 <w:sz w:val="18"/>
               </w:rPr>
-              <w:t>1,6</w:t>
+              <w:t>13,2</w:t>
             </w:r>
           </w:p>
         </w:tc>
@@ -2300,7 +2300,7 @@
                 <w:b w:val="0"/>
                 <w:sz w:val="18"/>
               </w:rPr>
-              <w:t>1,7</w:t>
+              <w:t>14,2</w:t>
             </w:r>
           </w:p>
         </w:tc>
@@ -2319,7 +2319,7 @@
                 <w:b w:val="0"/>
                 <w:sz w:val="18"/>
               </w:rPr>
-              <w:t>1,8</w:t>
+              <w:t>14,4</w:t>
             </w:r>
           </w:p>
         </w:tc>
@@ -2338,7 +2338,7 @@
                 <w:b w:val="0"/>
                 <w:sz w:val="18"/>
               </w:rPr>
-              <w:t>1,8</w:t>
+              <w:t>14,6</w:t>
             </w:r>
           </w:p>
         </w:tc>
@@ -2357,7 +2357,7 @@
                 <w:b w:val="0"/>
                 <w:sz w:val="18"/>
               </w:rPr>
-              <w:t>1,8</w:t>
+              <w:t>14,8</w:t>
             </w:r>
           </w:p>
         </w:tc>
@@ -2376,7 +2376,7 @@
                 <w:b w:val="0"/>
                 <w:sz w:val="18"/>
               </w:rPr>
-              <w:t>1,8</w:t>
+              <w:t>15,0</w:t>
             </w:r>
           </w:p>
         </w:tc>
@@ -2395,7 +2395,7 @@
                 <w:b w:val="0"/>
                 <w:sz w:val="18"/>
               </w:rPr>
-              <w:t>−0,6%</w:t>
+              <w:t>−0,8%</w:t>
             </w:r>
           </w:p>
         </w:tc>
@@ -2414,7 +2414,7 @@
                 <w:b w:val="0"/>
                 <w:sz w:val="18"/>
               </w:rPr>
-              <w:t>−0,9%</w:t>
+              <w:t>−1,3%</w:t>
             </w:r>
           </w:p>
         </w:tc>
@@ -2433,7 +2433,7 @@
                 <w:b w:val="0"/>
                 <w:sz w:val="18"/>
               </w:rPr>
-              <w:t>−1,3%</w:t>
+              <w:t>−1,9%</w:t>
             </w:r>
           </w:p>
         </w:tc>
@@ -2452,7 +2452,7 @@
                 <w:b w:val="0"/>
                 <w:sz w:val="18"/>
               </w:rPr>
-              <w:t>−1,7%</w:t>
+              <w:t>−2,5%</w:t>
             </w:r>
           </w:p>
         </w:tc>
@@ -2471,7 +2471,7 @@
                 <w:b w:val="0"/>
                 <w:sz w:val="18"/>
               </w:rPr>
-              <w:t>−3,0%</w:t>
+              <w:t>−3,4%</w:t>
             </w:r>
           </w:p>
         </w:tc>
@@ -2492,7 +2492,7 @@
                 <w:b w:val="0"/>
                 <w:sz w:val="18"/>
               </w:rPr>
-              <w:t>PI</w:t>
+              <w:t>RR</w:t>
             </w:r>
           </w:p>
         </w:tc>
@@ -2511,7 +2511,7 @@
                 <w:b w:val="0"/>
                 <w:sz w:val="18"/>
               </w:rPr>
-              <w:t>6,4</w:t>
+              <w:t>1,6</w:t>
             </w:r>
           </w:p>
         </w:tc>
@@ -2530,7 +2530,7 @@
                 <w:b w:val="0"/>
                 <w:sz w:val="18"/>
               </w:rPr>
-              <w:t>6,9</w:t>
+              <w:t>1,7</w:t>
             </w:r>
           </w:p>
         </w:tc>
@@ -2549,7 +2549,7 @@
                 <w:b w:val="0"/>
                 <w:sz w:val="18"/>
               </w:rPr>
-              <w:t>7,0</w:t>
+              <w:t>1,8</w:t>
             </w:r>
           </w:p>
         </w:tc>
@@ -2568,7 +2568,7 @@
                 <w:b w:val="0"/>
                 <w:sz w:val="18"/>
               </w:rPr>
-              <w:t>7,1</w:t>
+              <w:t>1,8</w:t>
             </w:r>
           </w:p>
         </w:tc>
@@ -2587,7 +2587,7 @@
                 <w:b w:val="0"/>
                 <w:sz w:val="18"/>
               </w:rPr>
-              <w:t>7,3</w:t>
+              <w:t>1,8</w:t>
             </w:r>
           </w:p>
         </w:tc>
@@ -2606,7 +2606,7 @@
                 <w:b w:val="0"/>
                 <w:sz w:val="18"/>
               </w:rPr>
-              <w:t>7,3</w:t>
+              <w:t>1,8</w:t>
             </w:r>
           </w:p>
         </w:tc>
@@ -2625,7 +2625,7 @@
                 <w:b w:val="0"/>
                 <w:sz w:val="18"/>
               </w:rPr>
-              <w:t>−0,3%</w:t>
+              <w:t>−0,6%</w:t>
             </w:r>
           </w:p>
         </w:tc>
@@ -2644,7 +2644,7 @@
                 <w:b w:val="0"/>
                 <w:sz w:val="18"/>
               </w:rPr>
-              <w:t>−0,4%</w:t>
+              <w:t>−0,9%</w:t>
             </w:r>
           </w:p>
         </w:tc>
@@ -2663,7 +2663,7 @@
                 <w:b w:val="0"/>
                 <w:sz w:val="18"/>
               </w:rPr>
-              <w:t>−0,5%</w:t>
+              <w:t>−1,3%</w:t>
             </w:r>
           </w:p>
         </w:tc>
@@ -2682,7 +2682,7 @@
                 <w:b w:val="0"/>
                 <w:sz w:val="18"/>
               </w:rPr>
-              <w:t>−0,7%</w:t>
+              <w:t>−1,7%</w:t>
             </w:r>
           </w:p>
         </w:tc>
@@ -2701,7 +2701,7 @@
                 <w:b w:val="0"/>
                 <w:sz w:val="18"/>
               </w:rPr>
-              <w:t>−2,8%</w:t>
+              <w:t>−3,0%</w:t>
             </w:r>
           </w:p>
         </w:tc>
@@ -2722,7 +2722,7 @@
                 <w:b w:val="0"/>
                 <w:sz w:val="18"/>
               </w:rPr>
-              <w:t>PB</w:t>
+              <w:t>PI</w:t>
             </w:r>
           </w:p>
         </w:tc>
@@ -2741,7 +2741,7 @@
                 <w:b w:val="0"/>
                 <w:sz w:val="18"/>
               </w:rPr>
-              <w:t>8,0</w:t>
+              <w:t>6,4</w:t>
             </w:r>
           </w:p>
         </w:tc>
@@ -2760,7 +2760,7 @@
                 <w:b w:val="0"/>
                 <w:sz w:val="18"/>
               </w:rPr>
-              <w:t>8,5</w:t>
+              <w:t>6,9</w:t>
             </w:r>
           </w:p>
         </w:tc>
@@ -2779,7 +2779,7 @@
                 <w:b w:val="0"/>
                 <w:sz w:val="18"/>
               </w:rPr>
-              <w:t>8,7</w:t>
+              <w:t>7,0</w:t>
             </w:r>
           </w:p>
         </w:tc>
@@ -2798,7 +2798,7 @@
                 <w:b w:val="0"/>
                 <w:sz w:val="18"/>
               </w:rPr>
-              <w:t>8,9</w:t>
+              <w:t>7,1</w:t>
             </w:r>
           </w:p>
         </w:tc>
@@ -2817,7 +2817,7 @@
                 <w:b w:val="0"/>
                 <w:sz w:val="18"/>
               </w:rPr>
-              <w:t>9,0</w:t>
+              <w:t>7,3</w:t>
             </w:r>
           </w:p>
         </w:tc>
@@ -2836,7 +2836,7 @@
                 <w:b w:val="0"/>
                 <w:sz w:val="18"/>
               </w:rPr>
-              <w:t>9,1</w:t>
+              <w:t>7,3</w:t>
             </w:r>
           </w:p>
         </w:tc>
@@ -2855,6 +2855,25 @@
                 <w:b w:val="0"/>
                 <w:sz w:val="18"/>
               </w:rPr>
+              <w:t>−0,3%</w:t>
+            </w:r>
+          </w:p>
+        </w:tc>
+        <w:tc>
+          <w:tcPr>
+            <w:tcW w:type="dxa" w:w="879"/>
+          </w:tcPr>
+          <w:p>
+            <w:pPr>
+              <w:spacing w:after="0" w:before="20"/>
+              <w:jc w:val="right"/>
+            </w:pPr>
+            <w:r/>
+            <w:r>
+              <w:rPr>
+                <w:b w:val="0"/>
+                <w:sz w:val="18"/>
+              </w:rPr>
               <w:t>−0,4%</w:t>
             </w:r>
           </w:p>
@@ -2874,6 +2893,25 @@
                 <w:b w:val="0"/>
                 <w:sz w:val="18"/>
               </w:rPr>
+              <w:t>−0,5%</w:t>
+            </w:r>
+          </w:p>
+        </w:tc>
+        <w:tc>
+          <w:tcPr>
+            <w:tcW w:type="dxa" w:w="879"/>
+          </w:tcPr>
+          <w:p>
+            <w:pPr>
+              <w:spacing w:after="0" w:before="20"/>
+              <w:jc w:val="right"/>
+            </w:pPr>
+            <w:r/>
+            <w:r>
+              <w:rPr>
+                <w:b w:val="0"/>
+                <w:sz w:val="18"/>
+              </w:rPr>
               <w:t>−0,7%</w:t>
             </w:r>
           </w:p>
@@ -2893,45 +2931,7 @@
                 <w:b w:val="0"/>
                 <w:sz w:val="18"/>
               </w:rPr>
-              <w:t>−0,9%</w:t>
-            </w:r>
-          </w:p>
-        </w:tc>
-        <w:tc>
-          <w:tcPr>
-            <w:tcW w:type="dxa" w:w="879"/>
-          </w:tcPr>
-          <w:p>
-            <w:pPr>
-              <w:spacing w:after="0" w:before="20"/>
-              <w:jc w:val="right"/>
-            </w:pPr>
-            <w:r/>
-            <w:r>
-              <w:rPr>
-                <w:b w:val="0"/>
-                <w:sz w:val="18"/>
-              </w:rPr>
-              <w:t>−1,1%</w:t>
-            </w:r>
-          </w:p>
-        </w:tc>
-        <w:tc>
-          <w:tcPr>
-            <w:tcW w:type="dxa" w:w="879"/>
-          </w:tcPr>
-          <w:p>
-            <w:pPr>
-              <w:spacing w:after="0" w:before="20"/>
-              <w:jc w:val="right"/>
-            </w:pPr>
-            <w:r/>
-            <w:r>
-              <w:rPr>
-                <w:b w:val="0"/>
-                <w:sz w:val="18"/>
-              </w:rPr>
-              <w:t>−2,7%</w:t>
+              <w:t>−2,8%</w:t>
             </w:r>
           </w:p>
         </w:tc>
@@ -2952,7 +2952,7 @@
                 <w:b w:val="0"/>
                 <w:sz w:val="18"/>
               </w:rPr>
-              <w:t>MS</w:t>
+              <w:t>PB</w:t>
             </w:r>
           </w:p>
         </w:tc>
@@ -2971,7 +2971,7 @@
                 <w:b w:val="0"/>
                 <w:sz w:val="18"/>
               </w:rPr>
-              <w:t>13,2</w:t>
+              <w:t>8,0</w:t>
             </w:r>
           </w:p>
         </w:tc>
@@ -2990,7 +2990,7 @@
                 <w:b w:val="0"/>
                 <w:sz w:val="18"/>
               </w:rPr>
-              <w:t>14,2</w:t>
+              <w:t>8,5</w:t>
             </w:r>
           </w:p>
         </w:tc>
@@ -3009,7 +3009,7 @@
                 <w:b w:val="0"/>
                 <w:sz w:val="18"/>
               </w:rPr>
-              <w:t>14,4</w:t>
+              <w:t>8,7</w:t>
             </w:r>
           </w:p>
         </w:tc>
@@ -3028,7 +3028,7 @@
                 <w:b w:val="0"/>
                 <w:sz w:val="18"/>
               </w:rPr>
-              <w:t>14,7</w:t>
+              <w:t>8,9</w:t>
             </w:r>
           </w:p>
         </w:tc>
@@ -3047,7 +3047,7 @@
                 <w:b w:val="0"/>
                 <w:sz w:val="18"/>
               </w:rPr>
-              <w:t>14,9</w:t>
+              <w:t>9,0</w:t>
             </w:r>
           </w:p>
         </w:tc>
@@ -3066,7 +3066,7 @@
                 <w:b w:val="0"/>
                 <w:sz w:val="18"/>
               </w:rPr>
-              <w:t>15,2</w:t>
+              <w:t>9,1</w:t>
             </w:r>
           </w:p>
         </w:tc>
@@ -3085,7 +3085,7 @@
                 <w:b w:val="0"/>
                 <w:sz w:val="18"/>
               </w:rPr>
-              <w:t>−0,6%</w:t>
+              <w:t>−0,4%</w:t>
             </w:r>
           </w:p>
         </w:tc>
@@ -3104,7 +3104,7 @@
                 <w:b w:val="0"/>
                 <w:sz w:val="18"/>
               </w:rPr>
-              <w:t>−1,0%</w:t>
+              <w:t>−0,7%</w:t>
             </w:r>
           </w:p>
         </w:tc>
@@ -3123,7 +3123,7 @@
                 <w:b w:val="0"/>
                 <w:sz w:val="18"/>
               </w:rPr>
-              <w:t>−1,4%</w:t>
+              <w:t>−0,9%</w:t>
             </w:r>
           </w:p>
         </w:tc>
@@ -3142,7 +3142,7 @@
                 <w:b w:val="0"/>
                 <w:sz w:val="18"/>
               </w:rPr>
-              <w:t>−1,8%</w:t>
+              <w:t>−1,1%</w:t>
             </w:r>
           </w:p>
         </w:tc>
@@ -3161,7 +3161,7 @@
                 <w:b w:val="0"/>
                 <w:sz w:val="18"/>
               </w:rPr>
-              <w:t>−2,6%</w:t>
+              <w:t>−2,7%</w:t>
             </w:r>
           </w:p>
         </w:tc>
@@ -5264,7 +5264,7 @@
                 <w:b w:val="0"/>
                 <w:sz w:val="18"/>
               </w:rPr>
-              <w:t>AM</w:t>
+              <w:t>AP</w:t>
             </w:r>
           </w:p>
         </w:tc>
@@ -5283,7 +5283,7 @@
                 <w:b w:val="0"/>
                 <w:sz w:val="18"/>
               </w:rPr>
-              <w:t>15,9</w:t>
+              <w:t>1,3</w:t>
             </w:r>
           </w:p>
         </w:tc>
@@ -5302,7 +5302,7 @@
                 <w:b w:val="0"/>
                 <w:sz w:val="18"/>
               </w:rPr>
-              <w:t>17,1</w:t>
+              <w:t>1,4</w:t>
             </w:r>
           </w:p>
         </w:tc>
@@ -5321,7 +5321,7 @@
                 <w:b w:val="0"/>
                 <w:sz w:val="18"/>
               </w:rPr>
-              <w:t>17,5</w:t>
+              <w:t>1,4</w:t>
             </w:r>
           </w:p>
         </w:tc>
@@ -5340,7 +5340,7 @@
                 <w:b w:val="0"/>
                 <w:sz w:val="18"/>
               </w:rPr>
-              <w:t>17,9</w:t>
+              <w:t>1,5</w:t>
             </w:r>
           </w:p>
         </w:tc>
@@ -5359,7 +5359,7 @@
                 <w:b w:val="0"/>
                 <w:sz w:val="18"/>
               </w:rPr>
-              <w:t>18,4</w:t>
+              <w:t>1,5</w:t>
             </w:r>
           </w:p>
         </w:tc>
@@ -5378,7 +5378,7 @@
                 <w:b w:val="0"/>
                 <w:sz w:val="18"/>
               </w:rPr>
-              <w:t>19,3</w:t>
+              <w:t>1,6</w:t>
             </w:r>
           </w:p>
         </w:tc>
@@ -5397,7 +5397,7 @@
                 <w:b w:val="0"/>
                 <w:sz w:val="18"/>
               </w:rPr>
-              <w:t>+0,0%</w:t>
+              <w:t>+0,7%</w:t>
             </w:r>
           </w:p>
         </w:tc>
@@ -5416,7 +5416,7 @@
                 <w:b w:val="0"/>
                 <w:sz w:val="18"/>
               </w:rPr>
-              <w:t>+0,2%</w:t>
+              <w:t>+1,6%</w:t>
             </w:r>
           </w:p>
         </w:tc>
@@ -5435,7 +5435,7 @@
                 <w:b w:val="0"/>
                 <w:sz w:val="18"/>
               </w:rPr>
-              <w:t>+0,5%</w:t>
+              <w:t>+2,5%</w:t>
             </w:r>
           </w:p>
         </w:tc>
@@ -5454,7 +5454,7 @@
                 <w:b w:val="0"/>
                 <w:sz w:val="18"/>
               </w:rPr>
-              <w:t>+0,7%</w:t>
+              <w:t>+3,3%</w:t>
             </w:r>
           </w:p>
         </w:tc>
@@ -5473,7 +5473,7 @@
                 <w:b w:val="0"/>
                 <w:sz w:val="18"/>
               </w:rPr>
-              <w:t>+3,8%</w:t>
+              <w:t>+4,0%</w:t>
             </w:r>
           </w:p>
         </w:tc>
@@ -5494,7 +5494,7 @@
                 <w:b w:val="0"/>
                 <w:sz w:val="18"/>
               </w:rPr>
-              <w:t>AP</w:t>
+              <w:t>AC</w:t>
             </w:r>
           </w:p>
         </w:tc>
@@ -5513,7 +5513,7 @@
                 <w:b w:val="0"/>
                 <w:sz w:val="18"/>
               </w:rPr>
-              <w:t>1,3</w:t>
+              <w:t>1,7</w:t>
             </w:r>
           </w:p>
         </w:tc>
@@ -5532,7 +5532,7 @@
                 <w:b w:val="0"/>
                 <w:sz w:val="18"/>
               </w:rPr>
-              <w:t>1,4</w:t>
+              <w:t>1,8</w:t>
             </w:r>
           </w:p>
         </w:tc>
@@ -5551,7 +5551,7 @@
                 <w:b w:val="0"/>
                 <w:sz w:val="18"/>
               </w:rPr>
-              <w:t>1,4</w:t>
+              <w:t>1,9</w:t>
             </w:r>
           </w:p>
         </w:tc>
@@ -5570,7 +5570,7 @@
                 <w:b w:val="0"/>
                 <w:sz w:val="18"/>
               </w:rPr>
-              <w:t>1,5</w:t>
+              <w:t>1,9</w:t>
             </w:r>
           </w:p>
         </w:tc>
@@ -5589,7 +5589,7 @@
                 <w:b w:val="0"/>
                 <w:sz w:val="18"/>
               </w:rPr>
-              <w:t>1,5</w:t>
+              <w:t>2,0</w:t>
             </w:r>
           </w:p>
         </w:tc>
@@ -5608,7 +5608,7 @@
                 <w:b w:val="0"/>
                 <w:sz w:val="18"/>
               </w:rPr>
-              <w:t>1,6</w:t>
+              <w:t>2,1</w:t>
             </w:r>
           </w:p>
         </w:tc>
@@ -5627,7 +5627,7 @@
                 <w:b w:val="0"/>
                 <w:sz w:val="18"/>
               </w:rPr>
-              <w:t>+0,7%</w:t>
+              <w:t>+0,5%</w:t>
             </w:r>
           </w:p>
         </w:tc>
@@ -5646,7 +5646,7 @@
                 <w:b w:val="0"/>
                 <w:sz w:val="18"/>
               </w:rPr>
-              <w:t>+1,6%</w:t>
+              <w:t>+1,2%</w:t>
             </w:r>
           </w:p>
         </w:tc>
@@ -5665,7 +5665,7 @@
                 <w:b w:val="0"/>
                 <w:sz w:val="18"/>
               </w:rPr>
-              <w:t>+2,5%</w:t>
+              <w:t>+2,0%</w:t>
             </w:r>
           </w:p>
         </w:tc>
@@ -5684,7 +5684,7 @@
                 <w:b w:val="0"/>
                 <w:sz w:val="18"/>
               </w:rPr>
-              <w:t>+3,3%</w:t>
+              <w:t>+2,7%</w:t>
             </w:r>
           </w:p>
         </w:tc>
@@ -5703,7 +5703,7 @@
                 <w:b w:val="0"/>
                 <w:sz w:val="18"/>
               </w:rPr>
-              <w:t>+4,0%</w:t>
+              <w:t>+5,8%</w:t>
             </w:r>
           </w:p>
         </w:tc>
@@ -5724,7 +5724,7 @@
                 <w:b w:val="0"/>
                 <w:sz w:val="18"/>
               </w:rPr>
-              <w:t>AC</w:t>
+              <w:t>DF</w:t>
             </w:r>
           </w:p>
         </w:tc>
@@ -5743,7 +5743,7 @@
                 <w:b w:val="0"/>
                 <w:sz w:val="18"/>
               </w:rPr>
-              <w:t>1,7</w:t>
+              <w:t>16,5</w:t>
             </w:r>
           </w:p>
         </w:tc>
@@ -5762,7 +5762,7 @@
                 <w:b w:val="0"/>
                 <w:sz w:val="18"/>
               </w:rPr>
-              <w:t>1,8</w:t>
+              <w:t>17,9</w:t>
             </w:r>
           </w:p>
         </w:tc>
@@ -5781,7 +5781,7 @@
                 <w:b w:val="0"/>
                 <w:sz w:val="18"/>
               </w:rPr>
-              <w:t>1,9</w:t>
+              <w:t>18,5</w:t>
             </w:r>
           </w:p>
         </w:tc>
@@ -5800,7 +5800,7 @@
                 <w:b w:val="0"/>
                 <w:sz w:val="18"/>
               </w:rPr>
-              <w:t>1,9</w:t>
+              <w:t>19,1</w:t>
             </w:r>
           </w:p>
         </w:tc>
@@ -5819,7 +5819,7 @@
                 <w:b w:val="0"/>
                 <w:sz w:val="18"/>
               </w:rPr>
-              <w:t>2,0</w:t>
+              <w:t>19,7</w:t>
             </w:r>
           </w:p>
         </w:tc>
@@ -5838,7 +5838,7 @@
                 <w:b w:val="0"/>
                 <w:sz w:val="18"/>
               </w:rPr>
-              <w:t>2,1</w:t>
+              <w:t>20,5</w:t>
             </w:r>
           </w:p>
         </w:tc>
@@ -5857,7 +5857,7 @@
                 <w:b w:val="0"/>
                 <w:sz w:val="18"/>
               </w:rPr>
-              <w:t>+0,5%</w:t>
+              <w:t>+0,8%</w:t>
             </w:r>
           </w:p>
         </w:tc>
@@ -5876,7 +5876,7 @@
                 <w:b w:val="0"/>
                 <w:sz w:val="18"/>
               </w:rPr>
-              <w:t>+1,2%</w:t>
+              <w:t>+1,9%</w:t>
             </w:r>
           </w:p>
         </w:tc>
@@ -5895,7 +5895,7 @@
                 <w:b w:val="0"/>
                 <w:sz w:val="18"/>
               </w:rPr>
-              <w:t>+2,0%</w:t>
+              <w:t>+2,9%</w:t>
             </w:r>
           </w:p>
         </w:tc>
@@ -5914,7 +5914,7 @@
                 <w:b w:val="0"/>
                 <w:sz w:val="18"/>
               </w:rPr>
-              <w:t>+2,7%</w:t>
+              <w:t>+4,0%</w:t>
             </w:r>
           </w:p>
         </w:tc>
@@ -5954,7 +5954,7 @@
                 <w:b w:val="0"/>
                 <w:sz w:val="18"/>
               </w:rPr>
-              <w:t>DF</w:t>
+              <w:t>RS</w:t>
             </w:r>
           </w:p>
         </w:tc>
@@ -5973,7 +5973,7 @@
                 <w:b w:val="0"/>
                 <w:sz w:val="18"/>
               </w:rPr>
-              <w:t>16,5</w:t>
+              <w:t>40,5</w:t>
             </w:r>
           </w:p>
         </w:tc>
@@ -5992,7 +5992,7 @@
                 <w:b w:val="0"/>
                 <w:sz w:val="18"/>
               </w:rPr>
-              <w:t>17,9</w:t>
+              <w:t>43,8</w:t>
             </w:r>
           </w:p>
         </w:tc>
@@ -6011,7 +6011,7 @@
                 <w:b w:val="0"/>
                 <w:sz w:val="18"/>
               </w:rPr>
-              <w:t>18,5</w:t>
+              <w:t>45,0</w:t>
             </w:r>
           </w:p>
         </w:tc>
@@ -6030,7 +6030,7 @@
                 <w:b w:val="0"/>
                 <w:sz w:val="18"/>
               </w:rPr>
-              <w:t>19,1</w:t>
+              <w:t>46,2</w:t>
             </w:r>
           </w:p>
         </w:tc>
@@ -6049,7 +6049,7 @@
                 <w:b w:val="0"/>
                 <w:sz w:val="18"/>
               </w:rPr>
-              <w:t>19,7</w:t>
+              <w:t>47,5</w:t>
             </w:r>
           </w:p>
         </w:tc>
@@ -6068,7 +6068,7 @@
                 <w:b w:val="0"/>
                 <w:sz w:val="18"/>
               </w:rPr>
-              <w:t>20,5</w:t>
+              <w:t>50,5</w:t>
             </w:r>
           </w:p>
         </w:tc>
@@ -6087,7 +6087,7 @@
                 <w:b w:val="0"/>
                 <w:sz w:val="18"/>
               </w:rPr>
-              <w:t>+0,8%</w:t>
+              <w:t>+0,4%</w:t>
             </w:r>
           </w:p>
         </w:tc>
@@ -6106,7 +6106,7 @@
                 <w:b w:val="0"/>
                 <w:sz w:val="18"/>
               </w:rPr>
-              <w:t>+1,9%</w:t>
+              <w:t>+0,9%</w:t>
             </w:r>
           </w:p>
         </w:tc>
@@ -6125,7 +6125,7 @@
                 <w:b w:val="0"/>
                 <w:sz w:val="18"/>
               </w:rPr>
-              <w:t>+2,9%</w:t>
+              <w:t>+1,5%</w:t>
             </w:r>
           </w:p>
         </w:tc>
@@ -6144,7 +6144,7 @@
                 <w:b w:val="0"/>
                 <w:sz w:val="18"/>
               </w:rPr>
-              <w:t>+4,0%</w:t>
+              <w:t>+2,1%</w:t>
             </w:r>
           </w:p>
         </w:tc>
@@ -6163,7 +6163,7 @@
                 <w:b w:val="0"/>
                 <w:sz w:val="18"/>
               </w:rPr>
-              <w:t>+5,8%</w:t>
+              <w:t>+6,1%</w:t>
             </w:r>
           </w:p>
         </w:tc>
@@ -6184,7 +6184,7 @@
                 <w:b w:val="0"/>
                 <w:sz w:val="18"/>
               </w:rPr>
-              <w:t>RS</w:t>
+              <w:t>RJ</w:t>
             </w:r>
           </w:p>
         </w:tc>
@@ -6203,7 +6203,7 @@
                 <w:b w:val="0"/>
                 <w:sz w:val="18"/>
               </w:rPr>
-              <w:t>40,5</w:t>
+              <w:t>48,5</w:t>
             </w:r>
           </w:p>
         </w:tc>
@@ -6222,7 +6222,7 @@
                 <w:b w:val="0"/>
                 <w:sz w:val="18"/>
               </w:rPr>
-              <w:t>43,8</w:t>
+              <w:t>52,5</w:t>
             </w:r>
           </w:p>
         </w:tc>
@@ -6241,7 +6241,7 @@
                 <w:b w:val="0"/>
                 <w:sz w:val="18"/>
               </w:rPr>
-              <w:t>45,0</w:t>
+              <w:t>53,9</w:t>
             </w:r>
           </w:p>
         </w:tc>
@@ -6260,7 +6260,7 @@
                 <w:b w:val="0"/>
                 <w:sz w:val="18"/>
               </w:rPr>
-              <w:t>46,2</w:t>
+              <w:t>55,4</w:t>
             </w:r>
           </w:p>
         </w:tc>
@@ -6279,7 +6279,7 @@
                 <w:b w:val="0"/>
                 <w:sz w:val="18"/>
               </w:rPr>
-              <w:t>47,5</w:t>
+              <w:t>57,0</w:t>
             </w:r>
           </w:p>
         </w:tc>
@@ -6298,7 +6298,7 @@
                 <w:b w:val="0"/>
                 <w:sz w:val="18"/>
               </w:rPr>
-              <w:t>50,5</w:t>
+              <w:t>60,6</w:t>
             </w:r>
           </w:p>
         </w:tc>
@@ -6336,7 +6336,7 @@
                 <w:b w:val="0"/>
                 <w:sz w:val="18"/>
               </w:rPr>
-              <w:t>+0,9%</w:t>
+              <w:t>+1,0%</w:t>
             </w:r>
           </w:p>
         </w:tc>
@@ -6355,7 +6355,7 @@
                 <w:b w:val="0"/>
                 <w:sz w:val="18"/>
               </w:rPr>
-              <w:t>+1,5%</w:t>
+              <w:t>+1,6%</w:t>
             </w:r>
           </w:p>
         </w:tc>
@@ -6374,7 +6374,7 @@
                 <w:b w:val="0"/>
                 <w:sz w:val="18"/>
               </w:rPr>
-              <w:t>+2,1%</w:t>
+              <w:t>+2,2%</w:t>
             </w:r>
           </w:p>
         </w:tc>
@@ -6393,7 +6393,7 @@
                 <w:b w:val="0"/>
                 <w:sz w:val="18"/>
               </w:rPr>
-              <w:t>+6,1%</w:t>
+              <w:t>+6,4%</w:t>
             </w:r>
           </w:p>
         </w:tc>
@@ -6417,7 +6417,7 @@
                 <w:b w:val="0"/>
                 <w:sz w:val="18"/>
               </w:rPr>
-              <w:t>RJ</w:t>
+              <w:t>AM</w:t>
             </w:r>
           </w:p>
         </w:tc>
@@ -6439,7 +6439,7 @@
                 <w:b w:val="0"/>
                 <w:sz w:val="18"/>
               </w:rPr>
-              <w:t>48,5</w:t>
+              <w:t>15,9</w:t>
             </w:r>
           </w:p>
         </w:tc>
@@ -6461,7 +6461,7 @@
                 <w:b w:val="0"/>
                 <w:sz w:val="18"/>
               </w:rPr>
-              <w:t>52,5</w:t>
+              <w:t>17,2</w:t>
             </w:r>
           </w:p>
         </w:tc>
@@ -6483,7 +6483,7 @@
                 <w:b w:val="0"/>
                 <w:sz w:val="18"/>
               </w:rPr>
-              <w:t>53,9</w:t>
+              <w:t>17,7</w:t>
             </w:r>
           </w:p>
         </w:tc>
@@ -6505,7 +6505,7 @@
                 <w:b w:val="0"/>
                 <w:sz w:val="18"/>
               </w:rPr>
-              <w:t>55,4</w:t>
+              <w:t>18,3</w:t>
             </w:r>
           </w:p>
         </w:tc>
@@ -6527,7 +6527,7 @@
                 <w:b w:val="0"/>
                 <w:sz w:val="18"/>
               </w:rPr>
-              <w:t>57,0</w:t>
+              <w:t>18,9</w:t>
             </w:r>
           </w:p>
         </w:tc>
@@ -6549,7 +6549,7 @@
                 <w:b w:val="0"/>
                 <w:sz w:val="18"/>
               </w:rPr>
-              <w:t>60,6</w:t>
+              <w:t>20,3</w:t>
             </w:r>
           </w:p>
         </w:tc>
@@ -6571,7 +6571,7 @@
                 <w:b w:val="0"/>
                 <w:sz w:val="18"/>
               </w:rPr>
-              <w:t>+0,4%</w:t>
+              <w:t>+0,7%</w:t>
             </w:r>
           </w:p>
         </w:tc>
@@ -6593,7 +6593,7 @@
                 <w:b w:val="0"/>
                 <w:sz w:val="18"/>
               </w:rPr>
-              <w:t>+1,0%</w:t>
+              <w:t>+1,6%</w:t>
             </w:r>
           </w:p>
         </w:tc>
@@ -6615,7 +6615,7 @@
                 <w:b w:val="0"/>
                 <w:sz w:val="18"/>
               </w:rPr>
-              <w:t>+1,6%</w:t>
+              <w:t>+2,5%</w:t>
             </w:r>
           </w:p>
         </w:tc>
@@ -6637,7 +6637,7 @@
                 <w:b w:val="0"/>
                 <w:sz w:val="18"/>
               </w:rPr>
-              <w:t>+2,2%</w:t>
+              <w:t>+3,4%</w:t>
             </w:r>
           </w:p>
         </w:tc>
@@ -6659,7 +6659,7 @@
                 <w:b w:val="0"/>
                 <w:sz w:val="18"/>
               </w:rPr>
-              <w:t>+6,4%</w:t>
+              <w:t>+9,1%</w:t>
             </w:r>
           </w:p>
         </w:tc>

</xml_diff>